<commit_message>
new rule "Clean up pairs", #19
</commit_message>
<xml_diff>
--- a/docs/documentation-de.docx
+++ b/docs/documentation-de.docx
@@ -5387,34 +5387,6 @@
           <w:szCs w:val="24"/>
           <w:lang w:val="de-DE" w:eastAsia="zh-CN" w:bidi="hi-IN"/>
         </w:rPr>
-      </w:r>
-    </w:p>
-    <w:p>
-      <w:pPr>
-        <w:pStyle w:val="Normal"/>
-        <w:tabs>
-          <w:tab w:val="clear" w:pos="709"/>
-          <w:tab w:val="left" w:pos="4470" w:leader="none"/>
-        </w:tabs>
-        <w:jc w:val="both"/>
-        <w:rPr>
-          <w:rFonts w:ascii="Bahnschrift Light" w:hAnsi="Bahnschrift Light" w:eastAsia="SimSun" w:cs="Arial"/>
-          <w:color w:val="auto"/>
-          <w:kern w:val="2"/>
-          <w:sz w:val="24"/>
-          <w:szCs w:val="24"/>
-          <w:lang w:val="de-DE" w:eastAsia="zh-CN" w:bidi="hi-IN"/>
-        </w:rPr>
-      </w:pPr>
-      <w:r>
-        <w:rPr>
-          <w:rFonts w:eastAsia="SimSun" w:cs="Arial" w:ascii="Bahnschrift Light" w:hAnsi="Bahnschrift Light"/>
-          <w:color w:val="auto"/>
-          <w:kern w:val="2"/>
-          <w:sz w:val="24"/>
-          <w:szCs w:val="24"/>
-          <w:lang w:val="de-DE" w:eastAsia="zh-CN" w:bidi="hi-IN"/>
-        </w:rPr>
         <w:drawing>
           <wp:anchor distT="0" distB="0" distL="0" distR="0" simplePos="0" relativeHeight="4" behindDoc="0" locked="0" layoutInCell="0" allowOverlap="1">
             <wp:simplePos x="0" y="0"/>
@@ -5665,6 +5637,122 @@
     <w:p>
       <w:pPr>
         <w:pStyle w:val="BodyText"/>
+        <w:widowControl w:val="false"/>
+        <w:suppressAutoHyphens w:val="true"/>
+        <w:bidi w:val="0"/>
+        <w:jc w:val="center"/>
+        <w:rPr>
+          <w:rFonts w:ascii="Bahnschrift Light" w:hAnsi="Bahnschrift Light" w:eastAsia="SimSun" w:cs="Arial"/>
+          <w:b/>
+          <w:bCs/>
+          <w:i/>
+          <w:iCs/>
+          <w:color w:val="auto"/>
+          <w:kern w:val="2"/>
+          <w:sz w:val="28"/>
+          <w:szCs w:val="28"/>
+          <w:lang w:val="de-DE" w:eastAsia="zh-CN" w:bidi="hi-IN"/>
+        </w:rPr>
+      </w:pPr>
+      <w:r>
+        <w:rPr>
+          <w:rFonts w:eastAsia="SimSun" w:cs="Arial" w:ascii="Bahnschrift Light" w:hAnsi="Bahnschrift Light"/>
+          <w:b/>
+          <w:bCs/>
+          <w:i/>
+          <w:iCs/>
+          <w:color w:val="auto"/>
+          <w:kern w:val="2"/>
+          <w:sz w:val="28"/>
+          <w:szCs w:val="28"/>
+          <w:lang w:val="de-DE" w:eastAsia="zh-CN" w:bidi="hi-IN"/>
+        </w:rPr>
+        <w:t>D</w:t>
+      </w:r>
+      <w:r>
+        <w:rPr>
+          <w:rFonts w:eastAsia="SimSun" w:cs="Arial" w:ascii="Bahnschrift Light" w:hAnsi="Bahnschrift Light"/>
+          <w:b/>
+          <w:bCs/>
+          <w:i/>
+          <w:iCs/>
+          <w:color w:val="auto"/>
+          <w:kern w:val="2"/>
+          <w:sz w:val="28"/>
+          <w:szCs w:val="28"/>
+          <w:lang w:val="de-DE" w:eastAsia="zh-CN" w:bidi="hi-IN"/>
+        </w:rPr>
+        <w:t>ie Regeln</w:t>
+      </w:r>
+    </w:p>
+    <w:p>
+      <w:pPr>
+        <w:pStyle w:val="BodyText"/>
+        <w:widowControl w:val="false"/>
+        <w:suppressAutoHyphens w:val="true"/>
+        <w:bidi w:val="0"/>
+        <w:jc w:val="both"/>
+        <w:rPr>
+          <w:rFonts w:ascii="Bahnschrift Light" w:hAnsi="Bahnschrift Light" w:eastAsia="SimSun" w:cs="Arial"/>
+          <w:b w:val="false"/>
+          <w:bCs w:val="false"/>
+          <w:color w:val="auto"/>
+          <w:kern w:val="2"/>
+          <w:sz w:val="24"/>
+          <w:szCs w:val="24"/>
+          <w:lang w:val="de-DE" w:eastAsia="zh-CN" w:bidi="hi-IN"/>
+        </w:rPr>
+      </w:pPr>
+      <w:r>
+        <w:rPr>
+          <w:rFonts w:eastAsia="SimSun" w:cs="Arial" w:ascii="Bahnschrift Light" w:hAnsi="Bahnschrift Light"/>
+          <w:b w:val="false"/>
+          <w:bCs w:val="false"/>
+          <w:i/>
+          <w:iCs/>
+          <w:color w:val="auto"/>
+          <w:kern w:val="2"/>
+          <w:sz w:val="24"/>
+          <w:szCs w:val="24"/>
+          <w:lang w:val="de-DE" w:eastAsia="zh-CN" w:bidi="hi-IN"/>
+        </w:rPr>
+        <w:t>Die nachfolgend beschriebenen „Regeln“ sind das Ergebnis meiner jahrelangen Beschäftigung mit Sudokus. Es sind keine offiziellen Sudoku-Regeln, sondern Erfahrungswerte bzw. eigene Strategien (rmb).</w:t>
+      </w:r>
+    </w:p>
+    <w:p>
+      <w:pPr>
+        <w:pStyle w:val="BodyText"/>
+        <w:widowControl w:val="false"/>
+        <w:suppressAutoHyphens w:val="true"/>
+        <w:bidi w:val="0"/>
+        <w:jc w:val="both"/>
+        <w:rPr>
+          <w:rFonts w:ascii="Bahnschrift Light" w:hAnsi="Bahnschrift Light" w:eastAsia="SimSun" w:cs="Arial"/>
+          <w:b/>
+          <w:bCs/>
+          <w:color w:val="auto"/>
+          <w:kern w:val="2"/>
+          <w:sz w:val="28"/>
+          <w:szCs w:val="28"/>
+          <w:lang w:val="de-DE" w:eastAsia="zh-CN" w:bidi="hi-IN"/>
+        </w:rPr>
+      </w:pPr>
+      <w:r>
+        <w:rPr>
+          <w:rFonts w:eastAsia="SimSun" w:cs="Arial" w:ascii="Bahnschrift Light" w:hAnsi="Bahnschrift Light"/>
+          <w:b/>
+          <w:bCs/>
+          <w:color w:val="auto"/>
+          <w:kern w:val="2"/>
+          <w:sz w:val="28"/>
+          <w:szCs w:val="28"/>
+          <w:lang w:val="de-DE" w:eastAsia="zh-CN" w:bidi="hi-IN"/>
+        </w:rPr>
+      </w:r>
+    </w:p>
+    <w:p>
+      <w:pPr>
+        <w:pStyle w:val="BodyText"/>
         <w:bidi w:val="0"/>
         <w:jc w:val="both"/>
         <w:rPr>
@@ -6359,6 +6447,54 @@
           <w:szCs w:val="28"/>
           <w:lang w:val="de-DE" w:eastAsia="zh-CN" w:bidi="hi-IN"/>
         </w:rPr>
+      </w:r>
+    </w:p>
+    <w:p>
+      <w:pPr>
+        <w:pStyle w:val="BodyText"/>
+        <w:bidi w:val="0"/>
+        <w:jc w:val="left"/>
+        <w:rPr>
+          <w:rFonts w:ascii="Bahnschrift Light" w:hAnsi="Bahnschrift Light"/>
+          <w:sz w:val="28"/>
+          <w:szCs w:val="28"/>
+        </w:rPr>
+      </w:pPr>
+      <w:r>
+        <w:rPr>
+          <w:rFonts w:eastAsia="SimSun" w:cs="Arial" w:ascii="Bahnschrift Light" w:hAnsi="Bahnschrift Light"/>
+          <w:b/>
+          <w:bCs/>
+          <w:color w:val="auto"/>
+          <w:kern w:val="2"/>
+          <w:sz w:val="28"/>
+          <w:szCs w:val="28"/>
+          <w:lang w:val="de-DE" w:eastAsia="zh-CN" w:bidi="hi-IN"/>
+        </w:rPr>
+      </w:r>
+    </w:p>
+    <w:p>
+      <w:pPr>
+        <w:pStyle w:val="BodyText"/>
+        <w:bidi w:val="0"/>
+        <w:jc w:val="left"/>
+        <w:rPr>
+          <w:rFonts w:ascii="Bahnschrift Light" w:hAnsi="Bahnschrift Light"/>
+          <w:sz w:val="28"/>
+          <w:szCs w:val="28"/>
+        </w:rPr>
+      </w:pPr>
+      <w:r>
+        <w:rPr>
+          <w:rFonts w:eastAsia="SimSun" w:cs="Arial" w:ascii="Bahnschrift Light" w:hAnsi="Bahnschrift Light"/>
+          <w:b/>
+          <w:bCs/>
+          <w:color w:val="auto"/>
+          <w:kern w:val="2"/>
+          <w:sz w:val="28"/>
+          <w:szCs w:val="28"/>
+          <w:lang w:val="de-DE" w:eastAsia="zh-CN" w:bidi="hi-IN"/>
+        </w:rPr>
         <w:t>Der Button „Regel -Double finden-“</w:t>
       </w:r>
     </w:p>
@@ -6960,14 +7096,9 @@
         <w:bidi w:val="0"/>
         <w:jc w:val="both"/>
         <w:rPr>
-          <w:rFonts w:ascii="Bahnschrift Light" w:hAnsi="Bahnschrift Light" w:eastAsia="SimSun" w:cs="Arial"/>
-          <w:b/>
-          <w:bCs/>
-          <w:color w:val="auto"/>
-          <w:kern w:val="2"/>
+          <w:rFonts w:ascii="Bahnschrift Light" w:hAnsi="Bahnschrift Light"/>
           <w:sz w:val="28"/>
           <w:szCs w:val="28"/>
-          <w:lang w:val="de-DE" w:eastAsia="zh-CN" w:bidi="hi-IN"/>
         </w:rPr>
       </w:pPr>
       <w:r>
@@ -6981,6 +7112,169 @@
           <w:szCs w:val="28"/>
           <w:lang w:val="de-DE" w:eastAsia="zh-CN" w:bidi="hi-IN"/>
         </w:rPr>
+        <w:t>Der Button „Regel -Trible finden-“</w:t>
+      </w:r>
+    </w:p>
+    <w:p>
+      <w:pPr>
+        <w:pStyle w:val="BodyText"/>
+        <w:widowControl w:val="false"/>
+        <w:suppressAutoHyphens w:val="true"/>
+        <w:bidi w:val="0"/>
+        <w:jc w:val="both"/>
+        <w:rPr>
+          <w:rFonts w:ascii="Bahnschrift Light" w:hAnsi="Bahnschrift Light" w:eastAsia="SimSun" w:cs="Arial"/>
+          <w:b/>
+          <w:bCs/>
+          <w:color w:val="auto"/>
+          <w:kern w:val="2"/>
+          <w:sz w:val="24"/>
+          <w:szCs w:val="24"/>
+          <w:lang w:val="de-DE" w:eastAsia="zh-CN" w:bidi="hi-IN"/>
+        </w:rPr>
+      </w:pPr>
+      <w:r>
+        <w:rPr>
+          <w:rFonts w:eastAsia="SimSun" w:cs="Arial" w:ascii="Bahnschrift Light" w:hAnsi="Bahnschrift Light"/>
+          <w:b/>
+          <w:bCs/>
+          <w:color w:val="auto"/>
+          <w:kern w:val="2"/>
+          <w:sz w:val="24"/>
+          <w:szCs w:val="24"/>
+          <w:lang w:val="de-DE" w:eastAsia="zh-CN" w:bidi="hi-IN"/>
+        </w:rPr>
+      </w:r>
+    </w:p>
+    <w:p>
+      <w:pPr>
+        <w:pStyle w:val="BodyText"/>
+        <w:bidi w:val="0"/>
+        <w:jc w:val="left"/>
+        <w:rPr>
+          <w:rFonts w:ascii="Bahnschrift Light" w:hAnsi="Bahnschrift Light"/>
+          <w:sz w:val="24"/>
+          <w:szCs w:val="24"/>
+        </w:rPr>
+      </w:pPr>
+      <w:r>
+        <w:rPr>
+          <w:rFonts w:ascii="Bahnschrift Light" w:hAnsi="Bahnschrift Light"/>
+          <w:sz w:val="24"/>
+          <w:szCs w:val="24"/>
+        </w:rPr>
+        <w:t>Diese Regel findet Dreierpaare,</w:t>
+      </w:r>
+    </w:p>
+    <w:p>
+      <w:pPr>
+        <w:pStyle w:val="BodyText"/>
+        <w:bidi w:val="0"/>
+        <w:jc w:val="left"/>
+        <w:rPr>
+          <w:rFonts w:ascii="Bahnschrift Light" w:hAnsi="Bahnschrift Light"/>
+          <w:sz w:val="24"/>
+          <w:szCs w:val="24"/>
+        </w:rPr>
+      </w:pPr>
+      <w:r>
+        <w:rPr>
+          <w:rFonts w:ascii="Bahnschrift Light" w:hAnsi="Bahnschrift Light"/>
+          <w:sz w:val="24"/>
+          <w:szCs w:val="24"/>
+        </w:rPr>
+        <w:t>-  in einer Zeile</w:t>
+      </w:r>
+    </w:p>
+    <w:p>
+      <w:pPr>
+        <w:pStyle w:val="BodyText"/>
+        <w:bidi w:val="0"/>
+        <w:jc w:val="left"/>
+        <w:rPr>
+          <w:rFonts w:ascii="Bahnschrift Light" w:hAnsi="Bahnschrift Light"/>
+          <w:sz w:val="24"/>
+          <w:szCs w:val="24"/>
+        </w:rPr>
+      </w:pPr>
+      <w:r>
+        <w:rPr>
+          <w:rFonts w:ascii="Bahnschrift Light" w:hAnsi="Bahnschrift Light"/>
+          <w:sz w:val="24"/>
+          <w:szCs w:val="24"/>
+        </w:rPr>
+        <w:t>- in einer Spalte</w:t>
+      </w:r>
+    </w:p>
+    <w:p>
+      <w:pPr>
+        <w:pStyle w:val="BodyText"/>
+        <w:bidi w:val="0"/>
+        <w:jc w:val="left"/>
+        <w:rPr>
+          <w:rFonts w:ascii="Bahnschrift Light" w:hAnsi="Bahnschrift Light"/>
+          <w:sz w:val="24"/>
+          <w:szCs w:val="24"/>
+        </w:rPr>
+      </w:pPr>
+      <w:r>
+        <w:rPr>
+          <w:rFonts w:ascii="Bahnschrift Light" w:hAnsi="Bahnschrift Light"/>
+          <w:sz w:val="24"/>
+          <w:szCs w:val="24"/>
+        </w:rPr>
+        <w:t>- oder in einem Unterquadrat</w:t>
+      </w:r>
+    </w:p>
+    <w:p>
+      <w:pPr>
+        <w:pStyle w:val="Normal"/>
+        <w:bidi w:val="0"/>
+        <w:jc w:val="left"/>
+        <w:rPr>
+          <w:rFonts w:ascii="Bahnschrift Light" w:hAnsi="Bahnschrift Light"/>
+          <w:sz w:val="24"/>
+          <w:szCs w:val="24"/>
+        </w:rPr>
+      </w:pPr>
+      <w:r>
+        <w:rPr>
+          <w:rFonts w:ascii="Bahnschrift Light" w:hAnsi="Bahnschrift Light"/>
+          <w:sz w:val="24"/>
+          <w:szCs w:val="24"/>
+        </w:rPr>
+        <w:t>und entfernt alle anderen möglichen Zahlen.</w:t>
+      </w:r>
+    </w:p>
+    <w:p>
+      <w:pPr>
+        <w:pStyle w:val="BodyText"/>
+        <w:widowControl w:val="false"/>
+        <w:suppressAutoHyphens w:val="true"/>
+        <w:bidi w:val="0"/>
+        <w:jc w:val="both"/>
+        <w:rPr>
+          <w:rFonts w:ascii="Bahnschrift Light" w:hAnsi="Bahnschrift Light" w:eastAsia="SimSun" w:cs="Arial"/>
+          <w:b/>
+          <w:bCs/>
+          <w:color w:val="auto"/>
+          <w:kern w:val="2"/>
+          <w:sz w:val="24"/>
+          <w:szCs w:val="24"/>
+          <w:lang w:val="de-DE" w:eastAsia="zh-CN" w:bidi="hi-IN"/>
+        </w:rPr>
+      </w:pPr>
+      <w:r>
+        <w:rPr>
+          <w:rFonts w:eastAsia="SimSun" w:cs="Arial" w:ascii="Bahnschrift Light" w:hAnsi="Bahnschrift Light"/>
+          <w:b/>
+          <w:bCs/>
+          <w:color w:val="auto"/>
+          <w:kern w:val="2"/>
+          <w:sz w:val="24"/>
+          <w:szCs w:val="24"/>
+          <w:lang w:val="de-DE" w:eastAsia="zh-CN" w:bidi="hi-IN"/>
+        </w:rPr>
       </w:r>
     </w:p>
     <w:p>
@@ -7007,7 +7301,7 @@
           <w:szCs w:val="28"/>
           <w:lang w:val="de-DE" w:eastAsia="zh-CN" w:bidi="hi-IN"/>
         </w:rPr>
-        <w:t>Der Button „Regel -Trible finden-“</w:t>
+        <w:t>Der Button „Regel -Kanns nicht sein/Darfs nicht sein-“</w:t>
       </w:r>
     </w:p>
     <w:p>
@@ -7018,26 +7312,16 @@
         <w:bidi w:val="0"/>
         <w:jc w:val="both"/>
         <w:rPr>
-          <w:rFonts w:ascii="Bahnschrift Light" w:hAnsi="Bahnschrift Light" w:eastAsia="SimSun" w:cs="Arial"/>
-          <w:b/>
-          <w:bCs/>
-          <w:color w:val="auto"/>
-          <w:kern w:val="2"/>
-          <w:sz w:val="24"/>
-          <w:szCs w:val="24"/>
-          <w:lang w:val="de-DE" w:eastAsia="zh-CN" w:bidi="hi-IN"/>
-        </w:rPr>
-      </w:pPr>
-      <w:r>
-        <w:rPr>
-          <w:rFonts w:eastAsia="SimSun" w:cs="Arial" w:ascii="Bahnschrift Light" w:hAnsi="Bahnschrift Light"/>
-          <w:b/>
-          <w:bCs/>
-          <w:color w:val="auto"/>
-          <w:kern w:val="2"/>
-          <w:sz w:val="24"/>
-          <w:szCs w:val="24"/>
-          <w:lang w:val="de-DE" w:eastAsia="zh-CN" w:bidi="hi-IN"/>
+          <w:rFonts w:ascii="Bahnschrift Light" w:hAnsi="Bahnschrift Light"/>
+          <w:sz w:val="24"/>
+          <w:szCs w:val="24"/>
+        </w:rPr>
+      </w:pPr>
+      <w:r>
+        <w:rPr>
+          <w:rFonts w:ascii="Bahnschrift Light" w:hAnsi="Bahnschrift Light"/>
+          <w:sz w:val="24"/>
+          <w:szCs w:val="24"/>
         </w:rPr>
       </w:r>
     </w:p>
@@ -7058,205 +7342,7 @@
           <w:sz w:val="24"/>
           <w:szCs w:val="24"/>
         </w:rPr>
-        <w:t>Diese Regel findet Dreierpaare,</w:t>
-      </w:r>
-    </w:p>
-    <w:p>
-      <w:pPr>
-        <w:pStyle w:val="BodyText"/>
-        <w:bidi w:val="0"/>
-        <w:jc w:val="left"/>
-        <w:rPr>
-          <w:rFonts w:ascii="Bahnschrift Light" w:hAnsi="Bahnschrift Light"/>
-          <w:sz w:val="24"/>
-          <w:szCs w:val="24"/>
-        </w:rPr>
-      </w:pPr>
-      <w:r>
-        <w:rPr>
-          <w:rFonts w:ascii="Bahnschrift Light" w:hAnsi="Bahnschrift Light"/>
-          <w:sz w:val="24"/>
-          <w:szCs w:val="24"/>
-        </w:rPr>
-        <w:t>-  in einer Zeile</w:t>
-      </w:r>
-    </w:p>
-    <w:p>
-      <w:pPr>
-        <w:pStyle w:val="BodyText"/>
-        <w:bidi w:val="0"/>
-        <w:jc w:val="left"/>
-        <w:rPr>
-          <w:rFonts w:ascii="Bahnschrift Light" w:hAnsi="Bahnschrift Light"/>
-          <w:sz w:val="24"/>
-          <w:szCs w:val="24"/>
-        </w:rPr>
-      </w:pPr>
-      <w:r>
-        <w:rPr>
-          <w:rFonts w:ascii="Bahnschrift Light" w:hAnsi="Bahnschrift Light"/>
-          <w:sz w:val="24"/>
-          <w:szCs w:val="24"/>
-        </w:rPr>
-        <w:t>- in einer Spalte</w:t>
-      </w:r>
-    </w:p>
-    <w:p>
-      <w:pPr>
-        <w:pStyle w:val="BodyText"/>
-        <w:bidi w:val="0"/>
-        <w:jc w:val="left"/>
-        <w:rPr>
-          <w:rFonts w:ascii="Bahnschrift Light" w:hAnsi="Bahnschrift Light"/>
-          <w:sz w:val="24"/>
-          <w:szCs w:val="24"/>
-        </w:rPr>
-      </w:pPr>
-      <w:r>
-        <w:rPr>
-          <w:rFonts w:ascii="Bahnschrift Light" w:hAnsi="Bahnschrift Light"/>
-          <w:sz w:val="24"/>
-          <w:szCs w:val="24"/>
-        </w:rPr>
-        <w:t>- oder in einem Unterquadrat</w:t>
-      </w:r>
-    </w:p>
-    <w:p>
-      <w:pPr>
-        <w:pStyle w:val="Normal"/>
-        <w:bidi w:val="0"/>
-        <w:jc w:val="left"/>
-        <w:rPr>
-          <w:rFonts w:ascii="Bahnschrift Light" w:hAnsi="Bahnschrift Light"/>
-          <w:sz w:val="24"/>
-          <w:szCs w:val="24"/>
-        </w:rPr>
-      </w:pPr>
-      <w:r>
-        <w:rPr>
-          <w:rFonts w:ascii="Bahnschrift Light" w:hAnsi="Bahnschrift Light"/>
-          <w:sz w:val="24"/>
-          <w:szCs w:val="24"/>
-        </w:rPr>
-        <w:t>und entfernt alle anderen möglichen Zahlen.</w:t>
-      </w:r>
-    </w:p>
-    <w:p>
-      <w:pPr>
-        <w:pStyle w:val="BodyText"/>
-        <w:widowControl w:val="false"/>
-        <w:suppressAutoHyphens w:val="true"/>
-        <w:bidi w:val="0"/>
-        <w:jc w:val="both"/>
-        <w:rPr>
-          <w:rFonts w:ascii="Bahnschrift Light" w:hAnsi="Bahnschrift Light" w:eastAsia="SimSun" w:cs="Arial"/>
-          <w:b/>
-          <w:bCs/>
-          <w:color w:val="auto"/>
-          <w:kern w:val="2"/>
-          <w:sz w:val="24"/>
-          <w:szCs w:val="24"/>
-          <w:lang w:val="de-DE" w:eastAsia="zh-CN" w:bidi="hi-IN"/>
-        </w:rPr>
-      </w:pPr>
-      <w:r>
-        <w:rPr>
-          <w:rFonts w:eastAsia="SimSun" w:cs="Arial" w:ascii="Bahnschrift Light" w:hAnsi="Bahnschrift Light"/>
-          <w:b/>
-          <w:bCs/>
-          <w:color w:val="auto"/>
-          <w:kern w:val="2"/>
-          <w:sz w:val="24"/>
-          <w:szCs w:val="24"/>
-          <w:lang w:val="de-DE" w:eastAsia="zh-CN" w:bidi="hi-IN"/>
-        </w:rPr>
-      </w:r>
-    </w:p>
-    <w:p>
-      <w:pPr>
-        <w:pStyle w:val="BodyText"/>
-        <w:widowControl w:val="false"/>
-        <w:suppressAutoHyphens w:val="true"/>
-        <w:bidi w:val="0"/>
-        <w:jc w:val="both"/>
-        <w:rPr>
-          <w:rFonts w:ascii="Bahnschrift Light" w:hAnsi="Bahnschrift Light"/>
-          <w:sz w:val="28"/>
-          <w:szCs w:val="28"/>
-        </w:rPr>
-      </w:pPr>
-      <w:r>
-        <w:rPr>
-          <w:rFonts w:eastAsia="SimSun" w:cs="Arial" w:ascii="Bahnschrift Light" w:hAnsi="Bahnschrift Light"/>
-          <w:b/>
-          <w:bCs/>
-          <w:color w:val="auto"/>
-          <w:kern w:val="2"/>
-          <w:sz w:val="28"/>
-          <w:szCs w:val="28"/>
-          <w:lang w:val="de-DE" w:eastAsia="zh-CN" w:bidi="hi-IN"/>
-        </w:rPr>
-        <w:t>Der Button „Regel -Kanns nicht sein/Darfs nicht sein-“</w:t>
-      </w:r>
-    </w:p>
-    <w:p>
-      <w:pPr>
-        <w:pStyle w:val="BodyText"/>
-        <w:widowControl w:val="false"/>
-        <w:suppressAutoHyphens w:val="true"/>
-        <w:bidi w:val="0"/>
-        <w:jc w:val="both"/>
-        <w:rPr>
-          <w:rFonts w:ascii="Bahnschrift Light" w:hAnsi="Bahnschrift Light"/>
-          <w:sz w:val="24"/>
-          <w:szCs w:val="24"/>
-        </w:rPr>
-      </w:pPr>
-      <w:r>
-        <w:rPr>
-          <w:rFonts w:ascii="Bahnschrift Light" w:hAnsi="Bahnschrift Light"/>
-          <w:sz w:val="24"/>
-          <w:szCs w:val="24"/>
-        </w:rPr>
-      </w:r>
-    </w:p>
-    <w:p>
-      <w:pPr>
-        <w:pStyle w:val="BodyText"/>
-        <w:bidi w:val="0"/>
-        <w:jc w:val="left"/>
-        <w:rPr>
-          <w:rFonts w:ascii="Bahnschrift Light" w:hAnsi="Bahnschrift Light"/>
-          <w:sz w:val="24"/>
-          <w:szCs w:val="24"/>
-        </w:rPr>
-      </w:pPr>
-      <w:r>
-        <w:rPr>
-          <w:rFonts w:ascii="Bahnschrift Light" w:hAnsi="Bahnschrift Light"/>
-          <w:sz w:val="24"/>
-          <w:szCs w:val="24"/>
-        </w:rPr>
         <w:t>Regel: Wenn eine Zahl in einem bestimmten Bereich nicht sein kann, darf sie in einem anderen auch nicht sein.</w:t>
-      </w:r>
-    </w:p>
-    <w:p>
-      <w:pPr>
-        <w:pStyle w:val="BodyText"/>
-        <w:bidi w:val="0"/>
-        <w:jc w:val="left"/>
-        <w:rPr>
-          <w:rFonts w:ascii="Bahnschrift Light" w:hAnsi="Bahnschrift Light"/>
-          <w:sz w:val="24"/>
-          <w:szCs w:val="24"/>
-        </w:rPr>
-      </w:pPr>
-      <w:r>
-        <w:rPr>
-          <w:rFonts w:ascii="Bahnschrift Light" w:hAnsi="Bahnschrift Light"/>
-          <w:sz w:val="24"/>
-          <w:szCs w:val="24"/>
-        </w:rPr>
       </w:r>
     </w:p>
     <w:p>
@@ -7606,72 +7692,14 @@
           <w:szCs w:val="24"/>
           <w:lang w:val="de-DE" w:eastAsia="zh-CN" w:bidi="hi-IN"/>
         </w:rPr>
-      </w:r>
-    </w:p>
-    <w:p>
-      <w:pPr>
-        <w:pStyle w:val="BodyText"/>
-        <w:widowControl w:val="false"/>
-        <w:suppressAutoHyphens w:val="true"/>
-        <w:bidi w:val="0"/>
-        <w:jc w:val="both"/>
-        <w:rPr>
-          <w:rFonts w:ascii="Bahnschrift Light" w:hAnsi="Bahnschrift Light"/>
-          <w:sz w:val="24"/>
-          <w:szCs w:val="24"/>
-        </w:rPr>
-      </w:pPr>
-      <w:r>
-        <w:rPr>
-          <w:rFonts w:eastAsia="SimSun" w:cs="Arial" w:ascii="Bahnschrift Light" w:hAnsi="Bahnschrift Light"/>
-          <w:b w:val="false"/>
-          <w:bCs w:val="false"/>
-          <w:color w:val="auto"/>
-          <w:kern w:val="2"/>
-          <w:sz w:val="24"/>
-          <w:szCs w:val="24"/>
-          <w:lang w:val="de-DE" w:eastAsia="zh-CN" w:bidi="hi-IN"/>
-        </w:rPr>
-        <w:t>Die Zahl 4 kann nicht im blauen Bereich sein und darf deshalb auch nicht im grünen Bereich sein.</w:t>
-      </w:r>
-    </w:p>
-    <w:p>
-      <w:pPr>
-        <w:pStyle w:val="BodyText"/>
-        <w:widowControl w:val="false"/>
-        <w:suppressAutoHyphens w:val="true"/>
-        <w:bidi w:val="0"/>
-        <w:jc w:val="both"/>
-        <w:rPr>
-          <w:rFonts w:ascii="Bahnschrift Light" w:hAnsi="Bahnschrift Light" w:eastAsia="SimSun" w:cs="Arial"/>
-          <w:b w:val="false"/>
-          <w:bCs w:val="false"/>
-          <w:color w:val="auto"/>
-          <w:kern w:val="2"/>
-          <w:sz w:val="24"/>
-          <w:szCs w:val="24"/>
-          <w:lang w:val="de-DE" w:eastAsia="zh-CN" w:bidi="hi-IN"/>
-        </w:rPr>
-      </w:pPr>
-      <w:r>
-        <w:rPr>
-          <w:rFonts w:eastAsia="SimSun" w:cs="Arial" w:ascii="Bahnschrift Light" w:hAnsi="Bahnschrift Light"/>
-          <w:b w:val="false"/>
-          <w:bCs w:val="false"/>
-          <w:color w:val="auto"/>
-          <w:kern w:val="2"/>
-          <w:sz w:val="24"/>
-          <w:szCs w:val="24"/>
-          <w:lang w:val="de-DE" w:eastAsia="zh-CN" w:bidi="hi-IN"/>
-        </w:rPr>
         <w:drawing>
-          <wp:anchor distT="0" distB="0" distL="0" distR="0" simplePos="0" relativeHeight="21" behindDoc="0" locked="0" layoutInCell="0" allowOverlap="1">
+          <wp:anchor distT="0" distB="0" distL="0" distR="360045" simplePos="0" relativeHeight="21" behindDoc="0" locked="0" layoutInCell="0" allowOverlap="1">
             <wp:simplePos x="0" y="0"/>
             <wp:positionH relativeFrom="column">
-              <wp:posOffset>681355</wp:posOffset>
+              <wp:posOffset>575945</wp:posOffset>
             </wp:positionH>
             <wp:positionV relativeFrom="paragraph">
-              <wp:posOffset>116205</wp:posOffset>
+              <wp:posOffset>78740</wp:posOffset>
             </wp:positionV>
             <wp:extent cx="2700020" cy="2793365"/>
             <wp:effectExtent l="0" t="0" r="0" b="0"/>
@@ -7720,6 +7748,111 @@
         <w:bidi w:val="0"/>
         <w:jc w:val="both"/>
         <w:rPr>
+          <w:rFonts w:ascii="Bahnschrift Light" w:hAnsi="Bahnschrift Light"/>
+          <w:sz w:val="24"/>
+          <w:szCs w:val="24"/>
+        </w:rPr>
+      </w:pPr>
+      <w:r>
+        <w:rPr>
+          <w:rFonts w:eastAsia="SimSun" w:cs="Arial" w:ascii="Bahnschrift Light" w:hAnsi="Bahnschrift Light"/>
+          <w:b w:val="false"/>
+          <w:bCs w:val="false"/>
+          <w:color w:val="auto"/>
+          <w:kern w:val="2"/>
+          <w:sz w:val="24"/>
+          <w:szCs w:val="24"/>
+          <w:lang w:val="de-DE" w:eastAsia="zh-CN" w:bidi="hi-IN"/>
+        </w:rPr>
+      </w:r>
+    </w:p>
+    <w:p>
+      <w:pPr>
+        <w:pStyle w:val="BodyText"/>
+        <w:widowControl w:val="false"/>
+        <w:suppressAutoHyphens w:val="true"/>
+        <w:bidi w:val="0"/>
+        <w:jc w:val="both"/>
+        <w:rPr>
+          <w:rFonts w:ascii="Bahnschrift Light" w:hAnsi="Bahnschrift Light"/>
+          <w:sz w:val="24"/>
+          <w:szCs w:val="24"/>
+        </w:rPr>
+      </w:pPr>
+      <w:r>
+        <w:rPr>
+          <w:rFonts w:eastAsia="SimSun" w:cs="Arial" w:ascii="Bahnschrift Light" w:hAnsi="Bahnschrift Light"/>
+          <w:b w:val="false"/>
+          <w:bCs w:val="false"/>
+          <w:color w:val="auto"/>
+          <w:kern w:val="2"/>
+          <w:sz w:val="24"/>
+          <w:szCs w:val="24"/>
+          <w:lang w:val="de-DE" w:eastAsia="zh-CN" w:bidi="hi-IN"/>
+        </w:rPr>
+      </w:r>
+    </w:p>
+    <w:p>
+      <w:pPr>
+        <w:pStyle w:val="BodyText"/>
+        <w:widowControl w:val="false"/>
+        <w:suppressAutoHyphens w:val="true"/>
+        <w:bidi w:val="0"/>
+        <w:jc w:val="both"/>
+        <w:rPr>
+          <w:rFonts w:ascii="Bahnschrift Light" w:hAnsi="Bahnschrift Light"/>
+          <w:sz w:val="24"/>
+          <w:szCs w:val="24"/>
+        </w:rPr>
+      </w:pPr>
+      <w:r>
+        <w:rPr>
+          <w:rFonts w:eastAsia="SimSun" w:cs="Arial" w:ascii="Bahnschrift Light" w:hAnsi="Bahnschrift Light"/>
+          <w:b w:val="false"/>
+          <w:bCs w:val="false"/>
+          <w:color w:val="auto"/>
+          <w:kern w:val="2"/>
+          <w:sz w:val="24"/>
+          <w:szCs w:val="24"/>
+          <w:lang w:val="de-DE" w:eastAsia="zh-CN" w:bidi="hi-IN"/>
+        </w:rPr>
+      </w:r>
+    </w:p>
+    <w:p>
+      <w:pPr>
+        <w:pStyle w:val="BodyText"/>
+        <w:widowControl w:val="false"/>
+        <w:suppressAutoHyphens w:val="true"/>
+        <w:bidi w:val="0"/>
+        <w:jc w:val="both"/>
+        <w:rPr>
+          <w:rFonts w:ascii="Bahnschrift Light" w:hAnsi="Bahnschrift Light"/>
+          <w:sz w:val="24"/>
+          <w:szCs w:val="24"/>
+        </w:rPr>
+      </w:pPr>
+      <w:r>
+        <w:rPr>
+          <w:rFonts w:eastAsia="SimSun" w:cs="Arial" w:ascii="Bahnschrift Light" w:hAnsi="Bahnschrift Light"/>
+          <w:b w:val="false"/>
+          <w:bCs w:val="false"/>
+          <w:color w:val="auto"/>
+          <w:kern w:val="2"/>
+          <w:sz w:val="24"/>
+          <w:szCs w:val="24"/>
+          <w:lang w:val="de-DE" w:eastAsia="zh-CN" w:bidi="hi-IN"/>
+        </w:rPr>
+        <w:t>Die Zahl 4 kann nicht im blauen Bereich sein und darf deshalb auch nicht im grünen Bereich sein.</w:t>
+      </w:r>
+    </w:p>
+    <w:p>
+      <w:pPr>
+        <w:pStyle w:val="BodyText"/>
+        <w:widowControl w:val="false"/>
+        <w:suppressAutoHyphens w:val="true"/>
+        <w:bidi w:val="0"/>
+        <w:jc w:val="both"/>
+        <w:rPr>
           <w:rFonts w:ascii="Bahnschrift Light" w:hAnsi="Bahnschrift Light" w:eastAsia="SimSun" w:cs="Arial"/>
           <w:b w:val="false"/>
           <w:bCs w:val="false"/>
@@ -7752,8 +7885,8 @@
         <w:jc w:val="both"/>
         <w:rPr>
           <w:rFonts w:ascii="Bahnschrift Light" w:hAnsi="Bahnschrift Light" w:eastAsia="SimSun" w:cs="Arial"/>
-          <w:b/>
-          <w:bCs/>
+          <w:b w:val="false"/>
+          <w:bCs w:val="false"/>
           <w:color w:val="auto"/>
           <w:kern w:val="2"/>
           <w:sz w:val="24"/>
@@ -7764,194 +7897,8 @@
       <w:r>
         <w:rPr>
           <w:rFonts w:eastAsia="SimSun" w:cs="Arial" w:ascii="Bahnschrift Light" w:hAnsi="Bahnschrift Light"/>
-          <w:b/>
-          <w:bCs/>
-          <w:color w:val="auto"/>
-          <w:kern w:val="2"/>
-          <w:sz w:val="24"/>
-          <w:szCs w:val="24"/>
-          <w:lang w:val="de-DE" w:eastAsia="zh-CN" w:bidi="hi-IN"/>
-        </w:rPr>
-      </w:r>
-    </w:p>
-    <w:p>
-      <w:pPr>
-        <w:pStyle w:val="BodyText"/>
-        <w:widowControl w:val="false"/>
-        <w:suppressAutoHyphens w:val="true"/>
-        <w:bidi w:val="0"/>
-        <w:jc w:val="both"/>
-        <w:rPr>
-          <w:rFonts w:ascii="Bahnschrift Light" w:hAnsi="Bahnschrift Light" w:eastAsia="SimSun" w:cs="Arial"/>
-          <w:b/>
-          <w:bCs/>
-          <w:color w:val="auto"/>
-          <w:kern w:val="2"/>
-          <w:sz w:val="24"/>
-          <w:szCs w:val="24"/>
-          <w:lang w:val="de-DE" w:eastAsia="zh-CN" w:bidi="hi-IN"/>
-        </w:rPr>
-      </w:pPr>
-      <w:r>
-        <w:rPr>
-          <w:rFonts w:eastAsia="SimSun" w:cs="Arial" w:ascii="Bahnschrift Light" w:hAnsi="Bahnschrift Light"/>
-          <w:b/>
-          <w:bCs/>
-          <w:color w:val="auto"/>
-          <w:kern w:val="2"/>
-          <w:sz w:val="24"/>
-          <w:szCs w:val="24"/>
-          <w:lang w:val="de-DE" w:eastAsia="zh-CN" w:bidi="hi-IN"/>
-        </w:rPr>
-      </w:r>
-    </w:p>
-    <w:p>
-      <w:pPr>
-        <w:pStyle w:val="BodyText"/>
-        <w:widowControl w:val="false"/>
-        <w:suppressAutoHyphens w:val="true"/>
-        <w:bidi w:val="0"/>
-        <w:jc w:val="both"/>
-        <w:rPr>
-          <w:rFonts w:ascii="Bahnschrift Light" w:hAnsi="Bahnschrift Light" w:eastAsia="SimSun" w:cs="Arial"/>
-          <w:b/>
-          <w:bCs/>
-          <w:color w:val="auto"/>
-          <w:kern w:val="2"/>
-          <w:sz w:val="24"/>
-          <w:szCs w:val="24"/>
-          <w:lang w:val="de-DE" w:eastAsia="zh-CN" w:bidi="hi-IN"/>
-        </w:rPr>
-      </w:pPr>
-      <w:r>
-        <w:rPr>
-          <w:rFonts w:eastAsia="SimSun" w:cs="Arial" w:ascii="Bahnschrift Light" w:hAnsi="Bahnschrift Light"/>
-          <w:b/>
-          <w:bCs/>
-          <w:color w:val="auto"/>
-          <w:kern w:val="2"/>
-          <w:sz w:val="24"/>
-          <w:szCs w:val="24"/>
-          <w:lang w:val="de-DE" w:eastAsia="zh-CN" w:bidi="hi-IN"/>
-        </w:rPr>
-      </w:r>
-    </w:p>
-    <w:p>
-      <w:pPr>
-        <w:pStyle w:val="BodyText"/>
-        <w:widowControl w:val="false"/>
-        <w:suppressAutoHyphens w:val="true"/>
-        <w:bidi w:val="0"/>
-        <w:jc w:val="both"/>
-        <w:rPr>
-          <w:rFonts w:ascii="Bahnschrift Light" w:hAnsi="Bahnschrift Light" w:eastAsia="SimSun" w:cs="Arial"/>
-          <w:b/>
-          <w:bCs/>
-          <w:color w:val="auto"/>
-          <w:kern w:val="2"/>
-          <w:sz w:val="24"/>
-          <w:szCs w:val="24"/>
-          <w:lang w:val="de-DE" w:eastAsia="zh-CN" w:bidi="hi-IN"/>
-        </w:rPr>
-      </w:pPr>
-      <w:r>
-        <w:rPr>
-          <w:rFonts w:eastAsia="SimSun" w:cs="Arial" w:ascii="Bahnschrift Light" w:hAnsi="Bahnschrift Light"/>
-          <w:b/>
-          <w:bCs/>
-          <w:color w:val="auto"/>
-          <w:kern w:val="2"/>
-          <w:sz w:val="24"/>
-          <w:szCs w:val="24"/>
-          <w:lang w:val="de-DE" w:eastAsia="zh-CN" w:bidi="hi-IN"/>
-        </w:rPr>
-      </w:r>
-    </w:p>
-    <w:p>
-      <w:pPr>
-        <w:pStyle w:val="BodyText"/>
-        <w:widowControl w:val="false"/>
-        <w:suppressAutoHyphens w:val="true"/>
-        <w:bidi w:val="0"/>
-        <w:jc w:val="both"/>
-        <w:rPr>
-          <w:rFonts w:ascii="Bahnschrift Light" w:hAnsi="Bahnschrift Light" w:eastAsia="SimSun" w:cs="Arial"/>
-          <w:b/>
-          <w:bCs/>
-          <w:color w:val="auto"/>
-          <w:kern w:val="2"/>
-          <w:sz w:val="24"/>
-          <w:szCs w:val="24"/>
-          <w:lang w:val="de-DE" w:eastAsia="zh-CN" w:bidi="hi-IN"/>
-        </w:rPr>
-      </w:pPr>
-      <w:r>
-        <w:rPr>
-          <w:rFonts w:eastAsia="SimSun" w:cs="Arial" w:ascii="Bahnschrift Light" w:hAnsi="Bahnschrift Light"/>
-          <w:b/>
-          <w:bCs/>
-          <w:color w:val="auto"/>
-          <w:kern w:val="2"/>
-          <w:sz w:val="24"/>
-          <w:szCs w:val="24"/>
-          <w:lang w:val="de-DE" w:eastAsia="zh-CN" w:bidi="hi-IN"/>
-        </w:rPr>
-      </w:r>
-    </w:p>
-    <w:p>
-      <w:pPr>
-        <w:pStyle w:val="BodyText"/>
-        <w:widowControl w:val="false"/>
-        <w:suppressAutoHyphens w:val="true"/>
-        <w:bidi w:val="0"/>
-        <w:jc w:val="both"/>
-        <w:rPr>
-          <w:rFonts w:ascii="Bahnschrift Light" w:hAnsi="Bahnschrift Light" w:eastAsia="SimSun" w:cs="Arial"/>
-          <w:b/>
-          <w:bCs/>
-          <w:color w:val="auto"/>
-          <w:kern w:val="2"/>
-          <w:sz w:val="24"/>
-          <w:szCs w:val="24"/>
-          <w:lang w:val="de-DE" w:eastAsia="zh-CN" w:bidi="hi-IN"/>
-        </w:rPr>
-      </w:pPr>
-      <w:r>
-        <w:rPr>
-          <w:rFonts w:eastAsia="SimSun" w:cs="Arial" w:ascii="Bahnschrift Light" w:hAnsi="Bahnschrift Light"/>
-          <w:b/>
-          <w:bCs/>
-          <w:color w:val="auto"/>
-          <w:kern w:val="2"/>
-          <w:sz w:val="24"/>
-          <w:szCs w:val="24"/>
-          <w:lang w:val="de-DE" w:eastAsia="zh-CN" w:bidi="hi-IN"/>
-        </w:rPr>
-      </w:r>
-    </w:p>
-    <w:p>
-      <w:pPr>
-        <w:pStyle w:val="BodyText"/>
-        <w:widowControl w:val="false"/>
-        <w:suppressAutoHyphens w:val="true"/>
-        <w:bidi w:val="0"/>
-        <w:jc w:val="both"/>
-        <w:rPr>
-          <w:rFonts w:ascii="Bahnschrift Light" w:hAnsi="Bahnschrift Light" w:eastAsia="SimSun" w:cs="Arial"/>
-          <w:b/>
-          <w:bCs/>
-          <w:color w:val="auto"/>
-          <w:kern w:val="2"/>
-          <w:sz w:val="24"/>
-          <w:szCs w:val="24"/>
-          <w:lang w:val="de-DE" w:eastAsia="zh-CN" w:bidi="hi-IN"/>
-        </w:rPr>
-      </w:pPr>
-      <w:r>
-        <w:rPr>
-          <w:rFonts w:eastAsia="SimSun" w:cs="Arial" w:ascii="Bahnschrift Light" w:hAnsi="Bahnschrift Light"/>
-          <w:b/>
-          <w:bCs/>
+          <w:b w:val="false"/>
+          <w:bCs w:val="false"/>
           <w:color w:val="auto"/>
           <w:kern w:val="2"/>
           <w:sz w:val="24"/>
@@ -9179,6 +9126,475 @@
     <w:p>
       <w:pPr>
         <w:pStyle w:val="BodyText"/>
+        <w:bidi w:val="0"/>
+        <w:jc w:val="left"/>
+        <w:rPr>
+          <w:rFonts w:ascii="Bahnschrift Light" w:hAnsi="Bahnschrift Light"/>
+          <w:sz w:val="28"/>
+          <w:szCs w:val="28"/>
+        </w:rPr>
+      </w:pPr>
+      <w:r>
+        <w:rPr>
+          <w:rFonts w:eastAsia="SimSun" w:cs="Arial" w:ascii="Bahnschrift Light" w:hAnsi="Bahnschrift Light"/>
+          <w:b/>
+          <w:bCs/>
+          <w:color w:val="auto"/>
+          <w:kern w:val="2"/>
+          <w:sz w:val="28"/>
+          <w:szCs w:val="28"/>
+          <w:lang w:val="de-DE" w:eastAsia="zh-CN" w:bidi="hi-IN"/>
+        </w:rPr>
+        <w:t>Der Button „Regel -</w:t>
+      </w:r>
+      <w:r>
+        <w:rPr>
+          <w:rFonts w:eastAsia="SimSun" w:cs="Arial" w:ascii="Bahnschrift Light" w:hAnsi="Bahnschrift Light"/>
+          <w:b/>
+          <w:bCs/>
+          <w:color w:val="auto"/>
+          <w:kern w:val="2"/>
+          <w:sz w:val="28"/>
+          <w:szCs w:val="28"/>
+          <w:lang w:val="de-DE" w:eastAsia="zh-CN" w:bidi="hi-IN"/>
+        </w:rPr>
+        <w:t>Paare bereinigen</w:t>
+      </w:r>
+      <w:r>
+        <w:rPr>
+          <w:rFonts w:eastAsia="SimSun" w:cs="Arial" w:ascii="Bahnschrift Light" w:hAnsi="Bahnschrift Light"/>
+          <w:b/>
+          <w:bCs/>
+          <w:color w:val="auto"/>
+          <w:kern w:val="2"/>
+          <w:sz w:val="28"/>
+          <w:szCs w:val="28"/>
+          <w:lang w:val="de-DE" w:eastAsia="zh-CN" w:bidi="hi-IN"/>
+        </w:rPr>
+        <w:t>-“</w:t>
+      </w:r>
+    </w:p>
+    <w:p>
+      <w:pPr>
+        <w:pStyle w:val="BodyText"/>
+        <w:widowControl w:val="false"/>
+        <w:suppressAutoHyphens w:val="true"/>
+        <w:bidi w:val="0"/>
+        <w:jc w:val="both"/>
+        <w:rPr>
+          <w:rFonts w:ascii="Bahnschrift Light" w:hAnsi="Bahnschrift Light" w:eastAsia="SimSun" w:cs="Arial"/>
+          <w:b/>
+          <w:bCs/>
+          <w:color w:val="auto"/>
+          <w:kern w:val="2"/>
+          <w:sz w:val="24"/>
+          <w:szCs w:val="24"/>
+          <w:lang w:val="de-DE" w:eastAsia="zh-CN" w:bidi="hi-IN"/>
+        </w:rPr>
+      </w:pPr>
+      <w:r>
+        <w:rPr>
+          <w:rFonts w:eastAsia="SimSun" w:cs="Arial" w:ascii="Bahnschrift Light" w:hAnsi="Bahnschrift Light"/>
+          <w:b/>
+          <w:bCs/>
+          <w:color w:val="auto"/>
+          <w:kern w:val="2"/>
+          <w:sz w:val="24"/>
+          <w:szCs w:val="24"/>
+          <w:lang w:val="de-DE" w:eastAsia="zh-CN" w:bidi="hi-IN"/>
+        </w:rPr>
+      </w:r>
+    </w:p>
+    <w:p>
+      <w:pPr>
+        <w:pStyle w:val="BodyText"/>
+        <w:bidi w:val="0"/>
+        <w:jc w:val="left"/>
+        <w:rPr>
+          <w:rFonts w:ascii="Bahnschrift Light" w:hAnsi="Bahnschrift Light"/>
+        </w:rPr>
+      </w:pPr>
+      <w:r>
+        <w:rPr>
+          <w:rFonts w:ascii="Bahnschrift Light" w:hAnsi="Bahnschrift Light"/>
+          <w:sz w:val="24"/>
+          <w:szCs w:val="24"/>
+        </w:rPr>
+        <w:t xml:space="preserve">Diese Regel </w:t>
+      </w:r>
+      <w:r>
+        <w:rPr>
+          <w:rFonts w:ascii="Bahnschrift Light" w:hAnsi="Bahnschrift Light"/>
+          <w:sz w:val="24"/>
+          <w:szCs w:val="24"/>
+        </w:rPr>
+        <w:t xml:space="preserve">erkennt </w:t>
+      </w:r>
+      <w:r>
+        <w:rPr>
+          <w:rFonts w:ascii="Bahnschrift Light" w:hAnsi="Bahnschrift Light"/>
+          <w:sz w:val="24"/>
+          <w:szCs w:val="24"/>
+        </w:rPr>
+        <w:t xml:space="preserve">gleiche Kombinationen </w:t>
+      </w:r>
+    </w:p>
+    <w:p>
+      <w:pPr>
+        <w:pStyle w:val="BodyText"/>
+        <w:bidi w:val="0"/>
+        <w:jc w:val="left"/>
+        <w:rPr>
+          <w:rFonts w:ascii="Bahnschrift Light" w:hAnsi="Bahnschrift Light"/>
+        </w:rPr>
+      </w:pPr>
+      <w:r>
+        <w:rPr>
+          <w:rFonts w:ascii="Bahnschrift Light" w:hAnsi="Bahnschrift Light"/>
+          <w:sz w:val="24"/>
+          <w:szCs w:val="24"/>
+        </w:rPr>
+        <w:t>-  in einer Zeile</w:t>
+      </w:r>
+    </w:p>
+    <w:p>
+      <w:pPr>
+        <w:pStyle w:val="BodyText"/>
+        <w:bidi w:val="0"/>
+        <w:jc w:val="left"/>
+        <w:rPr>
+          <w:rFonts w:ascii="Bahnschrift Light" w:hAnsi="Bahnschrift Light"/>
+        </w:rPr>
+      </w:pPr>
+      <w:r>
+        <w:rPr>
+          <w:rFonts w:ascii="Bahnschrift Light" w:hAnsi="Bahnschrift Light"/>
+          <w:sz w:val="24"/>
+          <w:szCs w:val="24"/>
+        </w:rPr>
+        <w:t>- in einer Spalte</w:t>
+      </w:r>
+    </w:p>
+    <w:p>
+      <w:pPr>
+        <w:pStyle w:val="BodyText"/>
+        <w:bidi w:val="0"/>
+        <w:jc w:val="left"/>
+        <w:rPr>
+          <w:rFonts w:ascii="Bahnschrift Light" w:hAnsi="Bahnschrift Light"/>
+        </w:rPr>
+      </w:pPr>
+      <w:r>
+        <w:rPr>
+          <w:rFonts w:ascii="Bahnschrift Light" w:hAnsi="Bahnschrift Light"/>
+        </w:rPr>
+        <w:t xml:space="preserve">- oder in </w:t>
+      </w:r>
+      <w:r>
+        <w:rPr>
+          <w:rFonts w:ascii="Bahnschrift Light" w:hAnsi="Bahnschrift Light"/>
+        </w:rPr>
+        <w:t>einem Unterquadrat,</w:t>
+      </w:r>
+    </w:p>
+    <w:p>
+      <w:pPr>
+        <w:pStyle w:val="BodyText"/>
+        <w:bidi w:val="0"/>
+        <w:jc w:val="left"/>
+        <w:rPr>
+          <w:rFonts w:ascii="Bahnschrift Light" w:hAnsi="Bahnschrift Light"/>
+        </w:rPr>
+      </w:pPr>
+      <w:r>
+        <w:rPr>
+          <w:rFonts w:ascii="Bahnschrift Light" w:hAnsi="Bahnschrift Light"/>
+        </w:rPr>
+        <w:t>die während eines normalen Lösungsvorgangs entstanden sind und bereinigt die entsprechende Zeile, Spalte oder das Unterquadrat.</w:t>
+      </w:r>
+    </w:p>
+    <w:p>
+      <w:pPr>
+        <w:pStyle w:val="BodyText"/>
+        <w:bidi w:val="0"/>
+        <w:jc w:val="left"/>
+        <w:rPr>
+          <w:rFonts w:ascii="Bahnschrift Light" w:hAnsi="Bahnschrift Light"/>
+        </w:rPr>
+      </w:pPr>
+      <w:r>
+        <w:rPr>
+          <w:rFonts w:ascii="Bahnschrift Light" w:hAnsi="Bahnschrift Light"/>
+        </w:rPr>
+      </w:r>
+    </w:p>
+    <w:p>
+      <w:pPr>
+        <w:pStyle w:val="BodyText"/>
+        <w:bidi w:val="0"/>
+        <w:jc w:val="left"/>
+        <w:rPr>
+          <w:rFonts w:ascii="Bahnschrift Light" w:hAnsi="Bahnschrift Light"/>
+        </w:rPr>
+      </w:pPr>
+      <w:r>
+        <w:rPr>
+          <w:rFonts w:ascii="Bahnschrift Light" w:hAnsi="Bahnschrift Light"/>
+        </w:rPr>
+        <w:t>Beispiel:</w:t>
+      </w:r>
+    </w:p>
+    <w:p>
+      <w:pPr>
+        <w:pStyle w:val="BodyText"/>
+        <w:bidi w:val="0"/>
+        <w:jc w:val="left"/>
+        <w:rPr>
+          <w:rFonts w:ascii="Bahnschrift Light" w:hAnsi="Bahnschrift Light"/>
+        </w:rPr>
+      </w:pPr>
+      <w:r>
+        <w:rPr>
+          <w:rFonts w:ascii="Bahnschrift Light" w:hAnsi="Bahnschrift Light"/>
+        </w:rPr>
+        <w:drawing>
+          <wp:anchor distT="0" distB="0" distL="0" distR="0" simplePos="0" relativeHeight="29" behindDoc="0" locked="0" layoutInCell="0" allowOverlap="1">
+            <wp:simplePos x="0" y="0"/>
+            <wp:positionH relativeFrom="column">
+              <wp:posOffset>429895</wp:posOffset>
+            </wp:positionH>
+            <wp:positionV relativeFrom="paragraph">
+              <wp:posOffset>92710</wp:posOffset>
+            </wp:positionV>
+            <wp:extent cx="2700020" cy="889000"/>
+            <wp:effectExtent l="0" t="0" r="0" b="0"/>
+            <wp:wrapTopAndBottom/>
+            <wp:docPr id="25" name="Bild10"/>
+            <wp:cNvGraphicFramePr>
+              <a:graphicFrameLocks xmlns:a="http://schemas.openxmlformats.org/drawingml/2006/main" noChangeAspect="1"/>
+            </wp:cNvGraphicFramePr>
+            <a:graphic xmlns:a="http://schemas.openxmlformats.org/drawingml/2006/main">
+              <a:graphicData uri="http://schemas.openxmlformats.org/drawingml/2006/picture">
+                <pic:pic xmlns:pic="http://schemas.openxmlformats.org/drawingml/2006/picture">
+                  <pic:nvPicPr>
+                    <pic:cNvPr id="25" name="Bild10"/>
+                    <pic:cNvPicPr>
+                      <a:picLocks noChangeAspect="1" noChangeArrowheads="1"/>
+                    </pic:cNvPicPr>
+                  </pic:nvPicPr>
+                  <pic:blipFill>
+                    <a:blip r:embed="rId27"/>
+                    <a:stretch>
+                      <a:fillRect/>
+                    </a:stretch>
+                  </pic:blipFill>
+                  <pic:spPr bwMode="auto">
+                    <a:xfrm>
+                      <a:off x="0" y="0"/>
+                      <a:ext cx="2700020" cy="889000"/>
+                    </a:xfrm>
+                    <a:prstGeom prst="rect">
+                      <a:avLst/>
+                    </a:prstGeom>
+                    <a:noFill/>
+                  </pic:spPr>
+                </pic:pic>
+              </a:graphicData>
+            </a:graphic>
+          </wp:anchor>
+        </w:drawing>
+      </w:r>
+    </w:p>
+    <w:p>
+      <w:pPr>
+        <w:pStyle w:val="BodyText"/>
+        <w:bidi w:val="0"/>
+        <w:jc w:val="left"/>
+        <w:rPr>
+          <w:rFonts w:ascii="Bahnschrift Light" w:hAnsi="Bahnschrift Light"/>
+        </w:rPr>
+      </w:pPr>
+      <w:r>
+        <w:rPr>
+          <w:rFonts w:ascii="Bahnschrift Light" w:hAnsi="Bahnschrift Light"/>
+        </w:rPr>
+        <w:t>In dieser Zeile sind zwei Kästchen mit 25 als mögliche Werte belegt. Die 2 und die 5 können nur in diesen beiden Kästchen gesetzt werden und in keinem anderen Kästchen dieser Zeile. Dadurch dürfen die 2 und die 5 in den restlichen Kästchen dieser Zeile nicht mehr erscheinen.</w:t>
+      </w:r>
+    </w:p>
+    <w:p>
+      <w:pPr>
+        <w:pStyle w:val="BodyText"/>
+        <w:bidi w:val="0"/>
+        <w:jc w:val="left"/>
+        <w:rPr>
+          <w:rFonts w:ascii="Bahnschrift Light" w:hAnsi="Bahnschrift Light"/>
+          <w:sz w:val="24"/>
+          <w:szCs w:val="24"/>
+        </w:rPr>
+      </w:pPr>
+      <w:r>
+        <w:rPr>
+          <w:rFonts w:ascii="Bahnschrift Light" w:hAnsi="Bahnschrift Light"/>
+          <w:sz w:val="24"/>
+          <w:szCs w:val="24"/>
+        </w:rPr>
+      </w:r>
+    </w:p>
+    <w:p>
+      <w:pPr>
+        <w:pStyle w:val="BodyText"/>
+        <w:bidi w:val="0"/>
+        <w:jc w:val="left"/>
+        <w:rPr>
+          <w:rFonts w:ascii="Bahnschrift Light" w:hAnsi="Bahnschrift Light"/>
+          <w:sz w:val="24"/>
+          <w:szCs w:val="24"/>
+        </w:rPr>
+      </w:pPr>
+      <w:r>
+        <w:rPr>
+          <w:rFonts w:ascii="Bahnschrift Light" w:hAnsi="Bahnschrift Light"/>
+          <w:sz w:val="24"/>
+          <w:szCs w:val="24"/>
+        </w:rPr>
+      </w:r>
+    </w:p>
+    <w:p>
+      <w:pPr>
+        <w:pStyle w:val="BodyText"/>
+        <w:bidi w:val="0"/>
+        <w:jc w:val="left"/>
+        <w:rPr>
+          <w:rFonts w:ascii="Bahnschrift Light" w:hAnsi="Bahnschrift Light"/>
+          <w:sz w:val="24"/>
+          <w:szCs w:val="24"/>
+        </w:rPr>
+      </w:pPr>
+      <w:r>
+        <w:rPr>
+          <w:rFonts w:ascii="Bahnschrift Light" w:hAnsi="Bahnschrift Light"/>
+          <w:sz w:val="24"/>
+          <w:szCs w:val="24"/>
+        </w:rPr>
+        <w:t>Resultat nach dem Durchführen der Regel:</w:t>
+      </w:r>
+    </w:p>
+    <w:p>
+      <w:pPr>
+        <w:pStyle w:val="BodyText"/>
+        <w:bidi w:val="0"/>
+        <w:jc w:val="left"/>
+        <w:rPr>
+          <w:rFonts w:ascii="Bahnschrift Light" w:hAnsi="Bahnschrift Light"/>
+          <w:sz w:val="24"/>
+          <w:szCs w:val="24"/>
+        </w:rPr>
+      </w:pPr>
+      <w:r>
+        <w:rPr/>
+        <w:drawing>
+          <wp:anchor distT="0" distB="0" distL="0" distR="0" simplePos="0" relativeHeight="30" behindDoc="0" locked="0" layoutInCell="0" allowOverlap="1">
+            <wp:simplePos x="0" y="0"/>
+            <wp:positionH relativeFrom="column">
+              <wp:posOffset>490855</wp:posOffset>
+            </wp:positionH>
+            <wp:positionV relativeFrom="paragraph">
+              <wp:posOffset>57150</wp:posOffset>
+            </wp:positionV>
+            <wp:extent cx="2700020" cy="882015"/>
+            <wp:effectExtent l="0" t="0" r="0" b="0"/>
+            <wp:wrapTopAndBottom/>
+            <wp:docPr id="26" name="Bild14"/>
+            <wp:cNvGraphicFramePr>
+              <a:graphicFrameLocks xmlns:a="http://schemas.openxmlformats.org/drawingml/2006/main" noChangeAspect="1"/>
+            </wp:cNvGraphicFramePr>
+            <a:graphic xmlns:a="http://schemas.openxmlformats.org/drawingml/2006/main">
+              <a:graphicData uri="http://schemas.openxmlformats.org/drawingml/2006/picture">
+                <pic:pic xmlns:pic="http://schemas.openxmlformats.org/drawingml/2006/picture">
+                  <pic:nvPicPr>
+                    <pic:cNvPr id="26" name="Bild14"/>
+                    <pic:cNvPicPr>
+                      <a:picLocks noChangeAspect="1" noChangeArrowheads="1"/>
+                    </pic:cNvPicPr>
+                  </pic:nvPicPr>
+                  <pic:blipFill>
+                    <a:blip r:embed="rId28"/>
+                    <a:stretch>
+                      <a:fillRect/>
+                    </a:stretch>
+                  </pic:blipFill>
+                  <pic:spPr bwMode="auto">
+                    <a:xfrm>
+                      <a:off x="0" y="0"/>
+                      <a:ext cx="2700020" cy="882015"/>
+                    </a:xfrm>
+                    <a:prstGeom prst="rect">
+                      <a:avLst/>
+                    </a:prstGeom>
+                    <a:noFill/>
+                  </pic:spPr>
+                </pic:pic>
+              </a:graphicData>
+            </a:graphic>
+          </wp:anchor>
+        </w:drawing>
+      </w:r>
+    </w:p>
+    <w:p>
+      <w:pPr>
+        <w:pStyle w:val="BodyText"/>
+        <w:widowControl w:val="false"/>
+        <w:suppressAutoHyphens w:val="true"/>
+        <w:bidi w:val="0"/>
+        <w:jc w:val="both"/>
+        <w:rPr>
+          <w:rFonts w:ascii="Bahnschrift Light" w:hAnsi="Bahnschrift Light"/>
+          <w:sz w:val="28"/>
+          <w:szCs w:val="28"/>
+        </w:rPr>
+      </w:pPr>
+      <w:r>
+        <w:rPr>
+          <w:rFonts w:eastAsia="SimSun" w:cs="Arial" w:ascii="Bahnschrift Light" w:hAnsi="Bahnschrift Light"/>
+          <w:b/>
+          <w:bCs/>
+          <w:color w:val="auto"/>
+          <w:kern w:val="2"/>
+          <w:sz w:val="28"/>
+          <w:szCs w:val="28"/>
+          <w:lang w:val="de-DE" w:eastAsia="zh-CN" w:bidi="hi-IN"/>
+        </w:rPr>
+      </w:r>
+    </w:p>
+    <w:p>
+      <w:pPr>
+        <w:pStyle w:val="BodyText"/>
+        <w:widowControl w:val="false"/>
+        <w:suppressAutoHyphens w:val="true"/>
+        <w:bidi w:val="0"/>
+        <w:jc w:val="both"/>
+        <w:rPr>
+          <w:rFonts w:ascii="Bahnschrift Light" w:hAnsi="Bahnschrift Light"/>
+          <w:sz w:val="28"/>
+          <w:szCs w:val="28"/>
+        </w:rPr>
+      </w:pPr>
+      <w:r>
+        <w:rPr>
+          <w:rFonts w:eastAsia="SimSun" w:cs="Arial" w:ascii="Bahnschrift Light" w:hAnsi="Bahnschrift Light"/>
+          <w:b/>
+          <w:bCs/>
+          <w:color w:val="auto"/>
+          <w:kern w:val="2"/>
+          <w:sz w:val="28"/>
+          <w:szCs w:val="28"/>
+          <w:lang w:val="de-DE" w:eastAsia="zh-CN" w:bidi="hi-IN"/>
+        </w:rPr>
+      </w:r>
+    </w:p>
+    <w:p>
+      <w:pPr>
+        <w:pStyle w:val="BodyText"/>
         <w:widowControl w:val="false"/>
         <w:suppressAutoHyphens w:val="true"/>
         <w:bidi w:val="0"/>
@@ -9973,7 +10389,7 @@
             <wp:extent cx="1362075" cy="1049655"/>
             <wp:effectExtent l="0" t="0" r="0" b="0"/>
             <wp:wrapTopAndBottom/>
-            <wp:docPr id="25" name="Bild4"/>
+            <wp:docPr id="27" name="Bild4"/>
             <wp:cNvGraphicFramePr>
               <a:graphicFrameLocks xmlns:a="http://schemas.openxmlformats.org/drawingml/2006/main" noChangeAspect="1"/>
             </wp:cNvGraphicFramePr>
@@ -9981,13 +10397,13 @@
               <a:graphicData uri="http://schemas.openxmlformats.org/drawingml/2006/picture">
                 <pic:pic xmlns:pic="http://schemas.openxmlformats.org/drawingml/2006/picture">
                   <pic:nvPicPr>
-                    <pic:cNvPr id="25" name="Bild4"/>
+                    <pic:cNvPr id="27" name="Bild4"/>
                     <pic:cNvPicPr>
                       <a:picLocks noChangeAspect="1" noChangeArrowheads="1"/>
                     </pic:cNvPicPr>
                   </pic:nvPicPr>
                   <pic:blipFill>
-                    <a:blip r:embed="rId27"/>
+                    <a:blip r:embed="rId29"/>
                     <a:srcRect l="-68" t="-71" r="-68" b="-71"/>
                     <a:stretch>
                       <a:fillRect/>
@@ -10220,7 +10636,7 @@
             <wp:extent cx="4091305" cy="1872615"/>
             <wp:effectExtent l="0" t="0" r="0" b="0"/>
             <wp:wrapSquare wrapText="largest"/>
-            <wp:docPr id="26" name="Bild5"/>
+            <wp:docPr id="28" name="Bild5"/>
             <wp:cNvGraphicFramePr>
               <a:graphicFrameLocks xmlns:a="http://schemas.openxmlformats.org/drawingml/2006/main" noChangeAspect="1"/>
             </wp:cNvGraphicFramePr>
@@ -10228,13 +10644,13 @@
               <a:graphicData uri="http://schemas.openxmlformats.org/drawingml/2006/picture">
                 <pic:pic xmlns:pic="http://schemas.openxmlformats.org/drawingml/2006/picture">
                   <pic:nvPicPr>
-                    <pic:cNvPr id="26" name="Bild5"/>
+                    <pic:cNvPr id="28" name="Bild5"/>
                     <pic:cNvPicPr>
                       <a:picLocks noChangeAspect="1" noChangeArrowheads="1"/>
                     </pic:cNvPicPr>
                   </pic:nvPicPr>
                   <pic:blipFill>
-                    <a:blip r:embed="rId28"/>
+                    <a:blip r:embed="rId30"/>
                     <a:stretch>
                       <a:fillRect/>
                     </a:stretch>
@@ -10589,7 +11005,7 @@
             <wp:extent cx="4122420" cy="1243330"/>
             <wp:effectExtent l="0" t="0" r="0" b="0"/>
             <wp:wrapSquare wrapText="largest"/>
-            <wp:docPr id="27" name="Bild27"/>
+            <wp:docPr id="29" name="Bild27"/>
             <wp:cNvGraphicFramePr>
               <a:graphicFrameLocks xmlns:a="http://schemas.openxmlformats.org/drawingml/2006/main" noChangeAspect="1"/>
             </wp:cNvGraphicFramePr>
@@ -10597,13 +11013,13 @@
               <a:graphicData uri="http://schemas.openxmlformats.org/drawingml/2006/picture">
                 <pic:pic xmlns:pic="http://schemas.openxmlformats.org/drawingml/2006/picture">
                   <pic:nvPicPr>
-                    <pic:cNvPr id="27" name="Bild27"/>
+                    <pic:cNvPr id="29" name="Bild27"/>
                     <pic:cNvPicPr>
                       <a:picLocks noChangeAspect="1" noChangeArrowheads="1"/>
                     </pic:cNvPicPr>
                   </pic:nvPicPr>
                   <pic:blipFill>
-                    <a:blip r:embed="rId29"/>
+                    <a:blip r:embed="rId31"/>
                     <a:stretch>
                       <a:fillRect/>
                     </a:stretch>
@@ -10768,9 +11184,9 @@
       </w:r>
     </w:p>
     <w:sectPr>
-      <w:footerReference w:type="even" r:id="rId30"/>
-      <w:footerReference w:type="default" r:id="rId31"/>
-      <w:footerReference w:type="first" r:id="rId32"/>
+      <w:footerReference w:type="even" r:id="rId32"/>
+      <w:footerReference w:type="default" r:id="rId33"/>
+      <w:footerReference w:type="first" r:id="rId34"/>
       <w:type w:val="nextPage"/>
       <w:pgSz w:w="11906" w:h="16838"/>
       <w:pgMar w:left="1134" w:right="1134" w:gutter="0" w:header="0" w:top="1134" w:footer="1134" w:bottom="1700"/>
@@ -10841,7 +11257,7 @@
         <w:sz w:val="16"/>
         <w:szCs w:val="16"/>
       </w:rPr>
-      <w:t>13</w:t>
+      <w:t>11</w:t>
     </w:r>
     <w:r>
       <w:rPr>
@@ -10883,7 +11299,7 @@
         <w:sz w:val="16"/>
         <w:szCs w:val="16"/>
       </w:rPr>
-      <w:t>13</w:t>
+      <w:t>14</w:t>
     </w:r>
     <w:r>
       <w:rPr>
@@ -10940,7 +11356,7 @@
         <w:sz w:val="16"/>
         <w:szCs w:val="16"/>
       </w:rPr>
-      <w:t>13</w:t>
+      <w:t>11</w:t>
     </w:r>
     <w:r>
       <w:rPr>
@@ -10982,7 +11398,7 @@
         <w:sz w:val="16"/>
         <w:szCs w:val="16"/>
       </w:rPr>
-      <w:t>13</w:t>
+      <w:t>14</w:t>
     </w:r>
     <w:r>
       <w:rPr>
@@ -11422,7 +11838,7 @@
   </w:style>
   <w:style w:type="paragraph" w:styleId="Heading3">
     <w:name w:val="heading 3"/>
-    <w:basedOn w:val="berschrift"/>
+    <w:basedOn w:val="berschriftuser"/>
     <w:next w:val="BodyText"/>
     <w:qFormat/>
     <w:pPr>
@@ -11558,15 +11974,15 @@
       <w:lang w:val="zxx" w:eastAsia="zxx" w:bidi="zxx"/>
     </w:rPr>
   </w:style>
-  <w:style w:type="character" w:styleId="Aufzhlungszeichen">
-    <w:name w:val="Aufzählungszeichen"/>
+  <w:style w:type="character" w:styleId="Aufzhlungszeichenuser">
+    <w:name w:val="Aufzählungszeichen (user)"/>
     <w:qFormat/>
     <w:rPr>
       <w:rFonts w:ascii="OpenSymbol;Arial Unicode MS" w:hAnsi="OpenSymbol;Arial Unicode MS" w:eastAsia="OpenSymbol;Arial Unicode MS" w:cs="OpenSymbol;Arial Unicode MS"/>
     </w:rPr>
   </w:style>
-  <w:style w:type="character" w:styleId="Nummerierungszeichen">
-    <w:name w:val="Nummerierungszeichen"/>
+  <w:style w:type="character" w:styleId="Nummerierungszeichenuser">
+    <w:name w:val="Nummerierungszeichen (user)"/>
     <w:qFormat/>
     <w:rPr/>
   </w:style>
@@ -11609,8 +12025,8 @@
       <w:u w:val="single"/>
     </w:rPr>
   </w:style>
-  <w:style w:type="character" w:styleId="Aufzhlungszeichenuser">
-    <w:name w:val="Aufzählungszeichen (user)"/>
+  <w:style w:type="character" w:styleId="Aufzhlungszeichen">
+    <w:name w:val="Aufzählungszeichen"/>
     <w:qFormat/>
     <w:rPr>
       <w:rFonts w:ascii="OpenSymbol" w:hAnsi="OpenSymbol" w:eastAsia="OpenSymbol" w:cs="OpenSymbol"/>
@@ -11626,7 +12042,7 @@
       <w:spacing w:before="240" w:after="120"/>
     </w:pPr>
     <w:rPr>
-      <w:rFonts w:ascii="Arial" w:hAnsi="Arial" w:eastAsia="Microsoft YaHei" w:cs="Arial"/>
+      <w:rFonts w:ascii="Liberation Sans" w:hAnsi="Liberation Sans" w:eastAsia="Microsoft YaHei" w:cs="Arial"/>
       <w:sz w:val="28"/>
       <w:szCs w:val="28"/>
     </w:rPr>
@@ -11684,7 +12100,7 @@
       <w:spacing w:before="240" w:after="120"/>
     </w:pPr>
     <w:rPr>
-      <w:rFonts w:ascii="Liberation Sans" w:hAnsi="Liberation Sans" w:eastAsia="Microsoft YaHei" w:cs="Arial"/>
+      <w:rFonts w:ascii="Arial" w:hAnsi="Arial" w:eastAsia="Microsoft YaHei" w:cs="Arial"/>
       <w:sz w:val="28"/>
       <w:szCs w:val="28"/>
     </w:rPr>
@@ -11700,8 +12116,8 @@
       <w:rFonts w:cs="Arial"/>
     </w:rPr>
   </w:style>
-  <w:style w:type="paragraph" w:styleId="VorformatierterText">
-    <w:name w:val="Vorformatierter Text"/>
+  <w:style w:type="paragraph" w:styleId="VorformatierterTextuser">
+    <w:name w:val="Vorformatierter Text (user)"/>
     <w:basedOn w:val="Normal"/>
     <w:qFormat/>
     <w:pPr>
@@ -11713,8 +12129,8 @@
       <w:szCs w:val="20"/>
     </w:rPr>
   </w:style>
-  <w:style w:type="paragraph" w:styleId="Kopf-Fuzeile">
-    <w:name w:val="Kopf-/Fußzeile"/>
+  <w:style w:type="paragraph" w:styleId="Kopf-Fuzeileuser">
+    <w:name w:val="Kopf-/Fußzeile (user)"/>
     <w:basedOn w:val="Normal"/>
     <w:qFormat/>
     <w:pPr>
@@ -11727,8 +12143,8 @@
     </w:pPr>
     <w:rPr/>
   </w:style>
-  <w:style w:type="paragraph" w:styleId="Kopf-Fuzeileuser">
-    <w:name w:val="Kopf-/Fußzeile (user)"/>
+  <w:style w:type="paragraph" w:styleId="Kopf-Fuzeile">
+    <w:name w:val="Kopf-/Fußzeile"/>
     <w:basedOn w:val="Normal"/>
     <w:qFormat/>
     <w:pPr/>
@@ -11736,7 +12152,7 @@
   </w:style>
   <w:style w:type="paragraph" w:styleId="Footer">
     <w:name w:val="footer"/>
-    <w:basedOn w:val="Kopf-Fuzeile"/>
+    <w:basedOn w:val="Kopf-Fuzeileuser"/>
     <w:pPr>
       <w:suppressLineNumbers/>
     </w:pPr>

</xml_diff>